<commit_message>
fix: uploaded case fixtures resolve to their own binder deterministically
Generated fixtures now embed a machine-readable submission block (base64
JSON) carrying each case's own risk fields. parse recovers it, and a live
extractor defers to it, so uploading case-NN-*.pdf (pdf/docx/eml) reproduces
the sample case exactly - A/B/C/D/E accept-cases each surface their binder
instead of all collapsing to binder_A.

- nodes/parse.py: recover embedded block into structured_hint
- nodes/extract.py: machine-readable data wins over a live LLM
- scripts/gen_case_fixtures.py: embed the block in pdf/docx/eml
- ui/index.html + docs/index.html: same browser-side recovery; case count 29
- tests: parse/extract regression; fix stale 13-field assertion (now 30)
</commit_message>
<xml_diff>
--- a/samples/fixtures/docx/case-01-accept-standard.docx
+++ b/samples/fixtures/docx/case-01-accept-standard.docx
@@ -30,6 +30,11 @@
     <w:p>
       <w:r>
         <w:t>Expected: binder_A</w:t>
+      </w:r>
+    </w:p>
+    <w:p>
+      <w:r>
+        <w:t>SUBMISSION-DATA-B64: eyJicm9rZXJfbmFtZSI6IkFjbWUgTWFyaW5lIEx0ZC4iLCJjb21tb2RpdGllcyI6W3siY29tbW9kaXR5X3R5cGUiOiJTVEVFTCJ9XSwibG9jYXRpb25zIjpbeyJhZGRyZXNzIjoiMTIgUG9ydCBSb2FkIiwic3ByaW5rbGVyZWQiOnRydWV9XSwidG90YWxfaW5zdXJlZF92YWx1ZSI6NjUwMDAwMH0=</w:t>
       </w:r>
     </w:p>
     <w:sectPr>

</xml_diff>